<commit_message>
i added to a file.
</commit_message>
<xml_diff>
--- a/This my way to success.docx
+++ b/This my way to success.docx
@@ -4,7 +4,16 @@
   <w:body>
     <w:p>
       <w:r>
-        <w:t>This my way to success</w:t>
+        <w:t xml:space="preserve">This </w:t>
+      </w:r>
+      <w:r>
+        <w:t xml:space="preserve">is </w:t>
+      </w:r>
+      <w:r>
+        <w:t>my way to success</w:t>
+      </w:r>
+      <w:r>
+        <w:t>, the journey to destiny.</w:t>
       </w:r>
     </w:p>
     <w:sectPr>

</xml_diff>